<commit_message>
Stable Tekla MCP server with STAAD import diagnostics
</commit_message>
<xml_diff>
--- a/TEKLA e3d mcp setup.docx
+++ b/TEKLA e3d mcp setup.docx
@@ -105,7 +105,7 @@
           <w:lang w:val="en-IN"/>
         </w:rPr>
         <w:pict w14:anchorId="0F73D179">
-          <v:rect id="_x0000_i1277" style="width:0;height:1.5pt" o:hralign="center" o:hrstd="t" o:hr="t" fillcolor="#a0a0a0" stroked="f"/>
+          <v:rect id="_x0000_i1025" style="width:0;height:1.5pt" o:hralign="center" o:hrstd="t" o:hr="t" fillcolor="#a0a0a0" stroked="f"/>
         </w:pict>
       </w:r>
     </w:p>
@@ -460,7 +460,7 @@
           <w:lang w:val="en-IN"/>
         </w:rPr>
         <w:pict w14:anchorId="6937D610">
-          <v:rect id="_x0000_i1278" style="width:0;height:1.5pt" o:hralign="center" o:hrstd="t" o:hr="t" fillcolor="#a0a0a0" stroked="f"/>
+          <v:rect id="_x0000_i1026" style="width:0;height:1.5pt" o:hralign="center" o:hrstd="t" o:hr="t" fillcolor="#a0a0a0" stroked="f"/>
         </w:pict>
       </w:r>
     </w:p>
@@ -1003,7 +1003,7 @@
           <w:lang w:val="en-IN"/>
         </w:rPr>
         <w:pict w14:anchorId="1E1C0C1D">
-          <v:rect id="_x0000_i1279" style="width:0;height:1.5pt" o:hralign="center" o:hrstd="t" o:hr="t" fillcolor="#a0a0a0" stroked="f"/>
+          <v:rect id="_x0000_i1027" style="width:0;height:1.5pt" o:hralign="center" o:hrstd="t" o:hr="t" fillcolor="#a0a0a0" stroked="f"/>
         </w:pict>
       </w:r>
     </w:p>
@@ -1117,7 +1117,7 @@
           <w:lang w:val="en-IN"/>
         </w:rPr>
         <w:pict w14:anchorId="35098862">
-          <v:rect id="_x0000_i1280" style="width:0;height:1.5pt" o:hralign="center" o:hrstd="t" o:hr="t" fillcolor="#a0a0a0" stroked="f"/>
+          <v:rect id="_x0000_i1028" style="width:0;height:1.5pt" o:hralign="center" o:hrstd="t" o:hr="t" fillcolor="#a0a0a0" stroked="f"/>
         </w:pict>
       </w:r>
     </w:p>
@@ -1144,24 +1144,40 @@
           <w:lang w:val="en-IN"/>
         </w:rPr>
       </w:pPr>
-      <w:r>
-        <w:rPr>
-          <w:lang w:val="en-IN"/>
-        </w:rPr>
-        <w:t>Minimum : 16 GB</w:t>
-      </w:r>
-    </w:p>
-    <w:p>
-      <w:pPr>
-        <w:rPr>
-          <w:lang w:val="en-IN"/>
-        </w:rPr>
-      </w:pPr>
-      <w:r>
-        <w:rPr>
-          <w:lang w:val="en-IN"/>
-        </w:rPr>
-        <w:t>Recommended : 32 GB</w:t>
+      <w:proofErr w:type="gramStart"/>
+      <w:r>
+        <w:rPr>
+          <w:lang w:val="en-IN"/>
+        </w:rPr>
+        <w:t>Minimum :</w:t>
+      </w:r>
+      <w:proofErr w:type="gramEnd"/>
+      <w:r>
+        <w:rPr>
+          <w:lang w:val="en-IN"/>
+        </w:rPr>
+        <w:t xml:space="preserve"> 16 GB</w:t>
+      </w:r>
+    </w:p>
+    <w:p>
+      <w:pPr>
+        <w:rPr>
+          <w:lang w:val="en-IN"/>
+        </w:rPr>
+      </w:pPr>
+      <w:proofErr w:type="gramStart"/>
+      <w:r>
+        <w:rPr>
+          <w:lang w:val="en-IN"/>
+        </w:rPr>
+        <w:t>Recommended :</w:t>
+      </w:r>
+      <w:proofErr w:type="gramEnd"/>
+      <w:r>
+        <w:rPr>
+          <w:lang w:val="en-IN"/>
+        </w:rPr>
+        <w:t xml:space="preserve"> 32 GB</w:t>
       </w:r>
     </w:p>
     <w:p>
@@ -1175,7 +1191,7 @@
           <w:lang w:val="en-IN"/>
         </w:rPr>
         <w:pict w14:anchorId="49C1D4E5">
-          <v:rect id="_x0000_i1281" style="width:0;height:1.5pt" o:hralign="center" o:hrstd="t" o:hr="t" fillcolor="#a0a0a0" stroked="f"/>
+          <v:rect id="_x0000_i1029" style="width:0;height:1.5pt" o:hralign="center" o:hrstd="t" o:hr="t" fillcolor="#a0a0a0" stroked="f"/>
         </w:pict>
       </w:r>
     </w:p>
@@ -1202,11 +1218,19 @@
           <w:lang w:val="en-IN"/>
         </w:rPr>
       </w:pPr>
-      <w:r>
-        <w:rPr>
-          <w:lang w:val="en-IN"/>
-        </w:rPr>
-        <w:t>Minimum : 100 GB Free</w:t>
+      <w:proofErr w:type="gramStart"/>
+      <w:r>
+        <w:rPr>
+          <w:lang w:val="en-IN"/>
+        </w:rPr>
+        <w:t>Minimum :</w:t>
+      </w:r>
+      <w:proofErr w:type="gramEnd"/>
+      <w:r>
+        <w:rPr>
+          <w:lang w:val="en-IN"/>
+        </w:rPr>
+        <w:t xml:space="preserve"> 100 GB Free</w:t>
       </w:r>
     </w:p>
     <w:p>
@@ -1220,7 +1244,7 @@
           <w:lang w:val="en-IN"/>
         </w:rPr>
         <w:pict w14:anchorId="2C111EFF">
-          <v:rect id="_x0000_i1282" style="width:0;height:1.5pt" o:hralign="center" o:hrstd="t" o:hr="t" fillcolor="#a0a0a0" stroked="f"/>
+          <v:rect id="_x0000_i1030" style="width:0;height:1.5pt" o:hralign="center" o:hrstd="t" o:hr="t" fillcolor="#a0a0a0" stroked="f"/>
         </w:pict>
       </w:r>
     </w:p>
@@ -1324,7 +1348,7 @@
           <w:lang w:val="en-IN"/>
         </w:rPr>
         <w:pict w14:anchorId="27DEF341">
-          <v:rect id="_x0000_i1283" style="width:0;height:1.5pt" o:hralign="center" o:hrstd="t" o:hr="t" fillcolor="#a0a0a0" stroked="f"/>
+          <v:rect id="_x0000_i1031" style="width:0;height:1.5pt" o:hralign="center" o:hrstd="t" o:hr="t" fillcolor="#a0a0a0" stroked="f"/>
         </w:pict>
       </w:r>
     </w:p>
@@ -1408,20 +1432,42 @@
           <w:lang w:val="en-IN"/>
         </w:rPr>
         <w:lastRenderedPageBreak/>
-        <w:t>Check npm:</w:t>
-      </w:r>
-    </w:p>
-    <w:p>
-      <w:pPr>
-        <w:rPr>
-          <w:lang w:val="en-IN"/>
-        </w:rPr>
-      </w:pPr>
-      <w:r>
-        <w:rPr>
-          <w:lang w:val="en-IN"/>
-        </w:rPr>
-        <w:t>npm --version</w:t>
+        <w:t xml:space="preserve">Check </w:t>
+      </w:r>
+      <w:proofErr w:type="spellStart"/>
+      <w:r>
+        <w:rPr>
+          <w:lang w:val="en-IN"/>
+        </w:rPr>
+        <w:t>npm</w:t>
+      </w:r>
+      <w:proofErr w:type="spellEnd"/>
+      <w:r>
+        <w:rPr>
+          <w:lang w:val="en-IN"/>
+        </w:rPr>
+        <w:t>:</w:t>
+      </w:r>
+    </w:p>
+    <w:p>
+      <w:pPr>
+        <w:rPr>
+          <w:lang w:val="en-IN"/>
+        </w:rPr>
+      </w:pPr>
+      <w:proofErr w:type="spellStart"/>
+      <w:r>
+        <w:rPr>
+          <w:lang w:val="en-IN"/>
+        </w:rPr>
+        <w:t>npm</w:t>
+      </w:r>
+      <w:proofErr w:type="spellEnd"/>
+      <w:r>
+        <w:rPr>
+          <w:lang w:val="en-IN"/>
+        </w:rPr>
+        <w:t xml:space="preserve"> --version</w:t>
       </w:r>
     </w:p>
     <w:p>
@@ -1461,7 +1507,7 @@
           <w:lang w:val="en-IN"/>
         </w:rPr>
         <w:pict w14:anchorId="2F26DD8E">
-          <v:rect id="_x0000_i1284" style="width:0;height:1.5pt" o:hralign="center" o:hrstd="t" o:hr="t" fillcolor="#a0a0a0" stroked="f"/>
+          <v:rect id="_x0000_i1032" style="width:0;height:1.5pt" o:hralign="center" o:hrstd="t" o:hr="t" fillcolor="#a0a0a0" stroked="f"/>
         </w:pict>
       </w:r>
     </w:p>
@@ -1552,7 +1598,7 @@
           <w:lang w:val="en-IN"/>
         </w:rPr>
         <w:pict w14:anchorId="010E5B5E">
-          <v:rect id="_x0000_i1285" style="width:0;height:1.5pt" o:hralign="center" o:hrstd="t" o:hr="t" fillcolor="#a0a0a0" stroked="f"/>
+          <v:rect id="_x0000_i1033" style="width:0;height:1.5pt" o:hralign="center" o:hrstd="t" o:hr="t" fillcolor="#a0a0a0" stroked="f"/>
         </w:pict>
       </w:r>
     </w:p>
@@ -1630,7 +1676,7 @@
           <w:lang w:val="en-IN"/>
         </w:rPr>
         <w:pict w14:anchorId="1ED3E344">
-          <v:rect id="_x0000_i1286" style="width:0;height:1.5pt" o:hralign="center" o:hrstd="t" o:hr="t" fillcolor="#a0a0a0" stroked="f"/>
+          <v:rect id="_x0000_i1034" style="width:0;height:1.5pt" o:hralign="center" o:hrstd="t" o:hr="t" fillcolor="#a0a0a0" stroked="f"/>
         </w:pict>
       </w:r>
     </w:p>
@@ -1701,7 +1747,7 @@
           <w:lang w:val="en-IN"/>
         </w:rPr>
         <w:pict w14:anchorId="41C2716F">
-          <v:rect id="_x0000_i1287" style="width:0;height:1.5pt" o:hralign="center" o:hrstd="t" o:hr="t" fillcolor="#a0a0a0" stroked="f"/>
+          <v:rect id="_x0000_i1035" style="width:0;height:1.5pt" o:hralign="center" o:hrstd="t" o:hr="t" fillcolor="#a0a0a0" stroked="f"/>
         </w:pict>
       </w:r>
     </w:p>
@@ -1827,7 +1873,7 @@
           <w:lang w:val="en-IN"/>
         </w:rPr>
         <w:pict w14:anchorId="5B868A79">
-          <v:rect id="_x0000_i1288" style="width:0;height:1.5pt" o:hralign="center" o:hrstd="t" o:hr="t" fillcolor="#a0a0a0" stroked="f"/>
+          <v:rect id="_x0000_i1036" style="width:0;height:1.5pt" o:hralign="center" o:hrstd="t" o:hr="t" fillcolor="#a0a0a0" stroked="f"/>
         </w:pict>
       </w:r>
     </w:p>
@@ -1963,7 +2009,7 @@
           <w:lang w:val="en-IN"/>
         </w:rPr>
         <w:pict w14:anchorId="537B2FB4">
-          <v:rect id="_x0000_i1289" style="width:0;height:1.5pt" o:hralign="center" o:hrstd="t" o:hr="t" fillcolor="#a0a0a0" stroked="f"/>
+          <v:rect id="_x0000_i1037" style="width:0;height:1.5pt" o:hralign="center" o:hrstd="t" o:hr="t" fillcolor="#a0a0a0" stroked="f"/>
         </w:pict>
       </w:r>
     </w:p>
@@ -2060,7 +2106,7 @@
           <w:lang w:val="en-IN"/>
         </w:rPr>
         <w:pict w14:anchorId="37E1EDE0">
-          <v:rect id="_x0000_i1290" style="width:0;height:1.5pt" o:hralign="center" o:hrstd="t" o:hr="t" fillcolor="#a0a0a0" stroked="f"/>
+          <v:rect id="_x0000_i1038" style="width:0;height:1.5pt" o:hralign="center" o:hrstd="t" o:hr="t" fillcolor="#a0a0a0" stroked="f"/>
         </w:pict>
       </w:r>
     </w:p>
@@ -2239,7 +2285,7 @@
           <w:lang w:val="en-IN"/>
         </w:rPr>
         <w:pict w14:anchorId="716F69E9">
-          <v:rect id="_x0000_i1291" style="width:0;height:1.5pt" o:hralign="center" o:hrstd="t" o:hr="t" fillcolor="#a0a0a0" stroked="f"/>
+          <v:rect id="_x0000_i1039" style="width:0;height:1.5pt" o:hralign="center" o:hrstd="t" o:hr="t" fillcolor="#a0a0a0" stroked="f"/>
         </w:pict>
       </w:r>
     </w:p>
@@ -2403,7 +2449,7 @@
           <w:lang w:val="en-IN"/>
         </w:rPr>
         <w:pict w14:anchorId="5A3F110B">
-          <v:rect id="_x0000_i1292" style="width:0;height:1.5pt" o:hralign="center" o:hrstd="t" o:hr="t" fillcolor="#a0a0a0" stroked="f"/>
+          <v:rect id="_x0000_i1040" style="width:0;height:1.5pt" o:hralign="center" o:hrstd="t" o:hr="t" fillcolor="#a0a0a0" stroked="f"/>
         </w:pict>
       </w:r>
     </w:p>
@@ -2430,25 +2476,29 @@
           <w:lang w:val="en-IN"/>
         </w:rPr>
       </w:pPr>
+      <w:proofErr w:type="spellStart"/>
       <w:r>
         <w:rPr>
           <w:lang w:val="en-IN"/>
         </w:rPr>
         <w:t>mcp</w:t>
       </w:r>
-    </w:p>
-    <w:p>
-      <w:pPr>
-        <w:rPr>
-          <w:lang w:val="en-IN"/>
-        </w:rPr>
-      </w:pPr>
+      <w:proofErr w:type="spellEnd"/>
+    </w:p>
+    <w:p>
+      <w:pPr>
+        <w:rPr>
+          <w:lang w:val="en-IN"/>
+        </w:rPr>
+      </w:pPr>
+      <w:proofErr w:type="spellStart"/>
       <w:r>
         <w:rPr>
           <w:lang w:val="en-IN"/>
         </w:rPr>
         <w:t>pythonnet</w:t>
       </w:r>
+      <w:proofErr w:type="spellEnd"/>
     </w:p>
     <w:p>
       <w:pPr>
@@ -2461,7 +2511,7 @@
           <w:lang w:val="en-IN"/>
         </w:rPr>
         <w:pict w14:anchorId="407DC783">
-          <v:rect id="_x0000_i1293" style="width:0;height:1.5pt" o:hralign="center" o:hrstd="t" o:hr="t" fillcolor="#a0a0a0" stroked="f"/>
+          <v:rect id="_x0000_i1041" style="width:0;height:1.5pt" o:hralign="center" o:hrstd="t" o:hr="t" fillcolor="#a0a0a0" stroked="f"/>
         </w:pict>
       </w:r>
     </w:p>
@@ -2532,7 +2582,7 @@
           <w:lang w:val="en-IN"/>
         </w:rPr>
         <w:pict w14:anchorId="345BB160">
-          <v:rect id="_x0000_i1294" style="width:0;height:1.5pt" o:hralign="center" o:hrstd="t" o:hr="t" fillcolor="#a0a0a0" stroked="f"/>
+          <v:rect id="_x0000_i1042" style="width:0;height:1.5pt" o:hralign="center" o:hrstd="t" o:hr="t" fillcolor="#a0a0a0" stroked="f"/>
         </w:pict>
       </w:r>
     </w:p>
@@ -2603,7 +2653,7 @@
           <w:lang w:val="en-IN"/>
         </w:rPr>
         <w:pict w14:anchorId="3CB07FF9">
-          <v:rect id="_x0000_i1295" style="width:0;height:1.5pt" o:hralign="center" o:hrstd="t" o:hr="t" fillcolor="#a0a0a0" stroked="f"/>
+          <v:rect id="_x0000_i1043" style="width:0;height:1.5pt" o:hralign="center" o:hrstd="t" o:hr="t" fillcolor="#a0a0a0" stroked="f"/>
         </w:pict>
       </w:r>
     </w:p>
@@ -2767,7 +2817,7 @@
           <w:lang w:val="en-IN"/>
         </w:rPr>
         <w:pict w14:anchorId="5A2A53F7">
-          <v:rect id="_x0000_i1296" style="width:0;height:1.5pt" o:hralign="center" o:hrstd="t" o:hr="t" fillcolor="#a0a0a0" stroked="f"/>
+          <v:rect id="_x0000_i1044" style="width:0;height:1.5pt" o:hralign="center" o:hrstd="t" o:hr="t" fillcolor="#a0a0a0" stroked="f"/>
         </w:pict>
       </w:r>
     </w:p>
@@ -2794,19 +2844,22 @@
           <w:lang w:val="en-IN"/>
         </w:rPr>
       </w:pPr>
+      <w:proofErr w:type="spellStart"/>
       <w:r>
         <w:rPr>
           <w:lang w:val="en-IN"/>
         </w:rPr>
         <w:t>mcp</w:t>
       </w:r>
-    </w:p>
-    <w:p>
-      <w:pPr>
-        <w:rPr>
-          <w:lang w:val="en-IN"/>
-        </w:rPr>
-      </w:pPr>
+      <w:proofErr w:type="spellEnd"/>
+    </w:p>
+    <w:p>
+      <w:pPr>
+        <w:rPr>
+          <w:lang w:val="en-IN"/>
+        </w:rPr>
+      </w:pPr>
+      <w:proofErr w:type="spellStart"/>
       <w:r>
         <w:rPr>
           <w:lang w:val="en-IN"/>
@@ -2814,6 +2867,7 @@
         <w:lastRenderedPageBreak/>
         <w:t>pythonnet</w:t>
       </w:r>
+      <w:proofErr w:type="spellEnd"/>
     </w:p>
     <w:p>
       <w:pPr>
@@ -2826,7 +2880,7 @@
           <w:lang w:val="en-IN"/>
         </w:rPr>
         <w:pict w14:anchorId="24E402C6">
-          <v:rect id="_x0000_i1297" style="width:0;height:1.5pt" o:hralign="center" o:hrstd="t" o:hr="t" fillcolor="#a0a0a0" stroked="f"/>
+          <v:rect id="_x0000_i1045" style="width:0;height:1.5pt" o:hralign="center" o:hrstd="t" o:hr="t" fillcolor="#a0a0a0" stroked="f"/>
         </w:pict>
       </w:r>
     </w:p>
@@ -2897,7 +2951,7 @@
           <w:lang w:val="en-IN"/>
         </w:rPr>
         <w:pict w14:anchorId="5A4B29D0">
-          <v:rect id="_x0000_i1298" style="width:0;height:1.5pt" o:hralign="center" o:hrstd="t" o:hr="t" fillcolor="#a0a0a0" stroked="f"/>
+          <v:rect id="_x0000_i1046" style="width:0;height:1.5pt" o:hralign="center" o:hrstd="t" o:hr="t" fillcolor="#a0a0a0" stroked="f"/>
         </w:pict>
       </w:r>
     </w:p>
@@ -2968,7 +3022,7 @@
           <w:lang w:val="en-IN"/>
         </w:rPr>
         <w:pict w14:anchorId="10900022">
-          <v:rect id="_x0000_i1299" style="width:0;height:1.5pt" o:hralign="center" o:hrstd="t" o:hr="t" fillcolor="#a0a0a0" stroked="f"/>
+          <v:rect id="_x0000_i1047" style="width:0;height:1.5pt" o:hralign="center" o:hrstd="t" o:hr="t" fillcolor="#a0a0a0" stroked="f"/>
         </w:pict>
       </w:r>
     </w:p>
@@ -3008,11 +3062,19 @@
           <w:lang w:val="en-IN"/>
         </w:rPr>
       </w:pPr>
-      <w:r>
-        <w:rPr>
-          <w:lang w:val="en-IN"/>
-        </w:rPr>
-        <w:t>npm install -g @modelcontextprotocol/inspector</w:t>
+      <w:proofErr w:type="spellStart"/>
+      <w:r>
+        <w:rPr>
+          <w:lang w:val="en-IN"/>
+        </w:rPr>
+        <w:t>npm</w:t>
+      </w:r>
+      <w:proofErr w:type="spellEnd"/>
+      <w:r>
+        <w:rPr>
+          <w:lang w:val="en-IN"/>
+        </w:rPr>
+        <w:t xml:space="preserve"> install -g @modelcontextprotocol/inspector</w:t>
       </w:r>
     </w:p>
     <w:p>
@@ -3034,11 +3096,19 @@
           <w:lang w:val="en-IN"/>
         </w:rPr>
       </w:pPr>
-      <w:r>
-        <w:rPr>
-          <w:lang w:val="en-IN"/>
-        </w:rPr>
-        <w:t>mcp-inspector</w:t>
+      <w:proofErr w:type="spellStart"/>
+      <w:r>
+        <w:rPr>
+          <w:lang w:val="en-IN"/>
+        </w:rPr>
+        <w:t>mcp</w:t>
+      </w:r>
+      <w:proofErr w:type="spellEnd"/>
+      <w:r>
+        <w:rPr>
+          <w:lang w:val="en-IN"/>
+        </w:rPr>
+        <w:t>-inspector</w:t>
       </w:r>
     </w:p>
     <w:p>
@@ -3052,7 +3122,7 @@
           <w:lang w:val="en-IN"/>
         </w:rPr>
         <w:pict w14:anchorId="7F61DD95">
-          <v:rect id="_x0000_i1300" style="width:0;height:1.5pt" o:hralign="center" o:hrstd="t" o:hr="t" fillcolor="#a0a0a0" stroked="f"/>
+          <v:rect id="_x0000_i1048" style="width:0;height:1.5pt" o:hralign="center" o:hrstd="t" o:hr="t" fillcolor="#a0a0a0" stroked="f"/>
         </w:pict>
       </w:r>
     </w:p>
@@ -3253,7 +3323,7 @@
           <w:lang w:val="en-IN"/>
         </w:rPr>
         <w:pict w14:anchorId="687E9709">
-          <v:rect id="_x0000_i1301" style="width:0;height:1.5pt" o:hralign="center" o:hrstd="t" o:hr="t" fillcolor="#a0a0a0" stroked="f"/>
+          <v:rect id="_x0000_i1049" style="width:0;height:1.5pt" o:hralign="center" o:hrstd="t" o:hr="t" fillcolor="#a0a0a0" stroked="f"/>
         </w:pict>
       </w:r>
     </w:p>
@@ -3333,7 +3403,7 @@
           <w:lang w:val="en-IN"/>
         </w:rPr>
         <w:pict w14:anchorId="5B75227D">
-          <v:rect id="_x0000_i1302" style="width:0;height:1.5pt" o:hralign="center" o:hrstd="t" o:hr="t" fillcolor="#a0a0a0" stroked="f"/>
+          <v:rect id="_x0000_i1050" style="width:0;height:1.5pt" o:hralign="center" o:hrstd="t" o:hr="t" fillcolor="#a0a0a0" stroked="f"/>
         </w:pict>
       </w:r>
     </w:p>
@@ -3443,7 +3513,7 @@
           <w:lang w:val="en-IN"/>
         </w:rPr>
         <w:pict w14:anchorId="37B8F6AB">
-          <v:rect id="_x0000_i1303" style="width:0;height:1.5pt" o:hralign="center" o:hrstd="t" o:hr="t" fillcolor="#a0a0a0" stroked="f"/>
+          <v:rect id="_x0000_i1051" style="width:0;height:1.5pt" o:hralign="center" o:hrstd="t" o:hr="t" fillcolor="#a0a0a0" stroked="f"/>
         </w:pict>
       </w:r>
     </w:p>
@@ -3510,12 +3580,16 @@
           <w:lang w:val="en-IN"/>
         </w:rPr>
       </w:pPr>
+      <w:proofErr w:type="spellStart"/>
+      <w:proofErr w:type="gramStart"/>
       <w:r>
         <w:rPr>
           <w:lang w:val="en-IN"/>
         </w:rPr>
         <w:t>shell:startup</w:t>
       </w:r>
+      <w:proofErr w:type="spellEnd"/>
+      <w:proofErr w:type="gramEnd"/>
     </w:p>
     <w:p>
       <w:pPr>
@@ -3671,7 +3745,7 @@
           <w:lang w:val="en-IN"/>
         </w:rPr>
         <w:pict w14:anchorId="4DDBCF1E">
-          <v:rect id="_x0000_i1304" style="width:0;height:1.5pt" o:hralign="center" o:hrstd="t" o:hr="t" fillcolor="#a0a0a0" stroked="f"/>
+          <v:rect id="_x0000_i1052" style="width:0;height:1.5pt" o:hralign="center" o:hrstd="t" o:hr="t" fillcolor="#a0a0a0" stroked="f"/>
         </w:pict>
       </w:r>
     </w:p>
@@ -3758,7 +3832,7 @@
           <w:lang w:val="en-IN"/>
         </w:rPr>
         <w:pict w14:anchorId="04A5994E">
-          <v:rect id="_x0000_i1305" style="width:0;height:1.5pt" o:hralign="center" o:hrstd="t" o:hr="t" fillcolor="#a0a0a0" stroked="f"/>
+          <v:rect id="_x0000_i1053" style="width:0;height:1.5pt" o:hralign="center" o:hrstd="t" o:hr="t" fillcolor="#a0a0a0" stroked="f"/>
         </w:pict>
       </w:r>
     </w:p>
@@ -3798,12 +3872,28 @@
           <w:lang w:val="en-IN"/>
         </w:rPr>
       </w:pPr>
-      <w:r>
-        <w:rPr>
-          <w:lang w:val="en-IN"/>
-        </w:rPr>
-        <w:t>nssm install TeklaMCP</w:t>
-      </w:r>
+      <w:proofErr w:type="spellStart"/>
+      <w:r>
+        <w:rPr>
+          <w:lang w:val="en-IN"/>
+        </w:rPr>
+        <w:t>nssm</w:t>
+      </w:r>
+      <w:proofErr w:type="spellEnd"/>
+      <w:r>
+        <w:rPr>
+          <w:lang w:val="en-IN"/>
+        </w:rPr>
+        <w:t xml:space="preserve"> install </w:t>
+      </w:r>
+      <w:proofErr w:type="spellStart"/>
+      <w:r>
+        <w:rPr>
+          <w:lang w:val="en-IN"/>
+        </w:rPr>
+        <w:t>TeklaMCP</w:t>
+      </w:r>
+      <w:proofErr w:type="spellEnd"/>
     </w:p>
     <w:p>
       <w:pPr>
@@ -3894,7 +3984,7 @@
           <w:lang w:val="en-IN"/>
         </w:rPr>
         <w:pict w14:anchorId="5FF6EBEC">
-          <v:rect id="_x0000_i1306" style="width:0;height:1.5pt" o:hralign="center" o:hrstd="t" o:hr="t" fillcolor="#a0a0a0" stroked="f"/>
+          <v:rect id="_x0000_i1054" style="width:0;height:1.5pt" o:hralign="center" o:hrstd="t" o:hr="t" fillcolor="#a0a0a0" stroked="f"/>
         </w:pict>
       </w:r>
     </w:p>
@@ -3921,11 +4011,19 @@
           <w:lang w:val="en-IN"/>
         </w:rPr>
       </w:pPr>
-      <w:r>
-        <w:rPr>
-          <w:lang w:val="en-IN"/>
-        </w:rPr>
-        <w:t>nssm install E3DMCP</w:t>
+      <w:proofErr w:type="spellStart"/>
+      <w:r>
+        <w:rPr>
+          <w:lang w:val="en-IN"/>
+        </w:rPr>
+        <w:t>nssm</w:t>
+      </w:r>
+      <w:proofErr w:type="spellEnd"/>
+      <w:r>
+        <w:rPr>
+          <w:lang w:val="en-IN"/>
+        </w:rPr>
+        <w:t xml:space="preserve"> install E3DMCP</w:t>
       </w:r>
     </w:p>
     <w:p>
@@ -4017,7 +4115,7 @@
           <w:lang w:val="en-IN"/>
         </w:rPr>
         <w:pict w14:anchorId="1EC5AB7B">
-          <v:rect id="_x0000_i1307" style="width:0;height:1.5pt" o:hralign="center" o:hrstd="t" o:hr="t" fillcolor="#a0a0a0" stroked="f"/>
+          <v:rect id="_x0000_i1055" style="width:0;height:1.5pt" o:hralign="center" o:hrstd="t" o:hr="t" fillcolor="#a0a0a0" stroked="f"/>
         </w:pict>
       </w:r>
     </w:p>
@@ -4048,8 +4146,16 @@
         <w:rPr>
           <w:lang w:val="en-IN"/>
         </w:rPr>
-        <w:t>net start TeklaMCP</w:t>
-      </w:r>
+        <w:t xml:space="preserve">net start </w:t>
+      </w:r>
+      <w:proofErr w:type="spellStart"/>
+      <w:r>
+        <w:rPr>
+          <w:lang w:val="en-IN"/>
+        </w:rPr>
+        <w:t>TeklaMCP</w:t>
+      </w:r>
+      <w:proofErr w:type="spellEnd"/>
     </w:p>
     <w:p>
       <w:pPr>
@@ -4075,7 +4181,7 @@
           <w:lang w:val="en-IN"/>
         </w:rPr>
         <w:pict w14:anchorId="205052FF">
-          <v:rect id="_x0000_i1308" style="width:0;height:1.5pt" o:hralign="center" o:hrstd="t" o:hr="t" fillcolor="#a0a0a0" stroked="f"/>
+          <v:rect id="_x0000_i1056" style="width:0;height:1.5pt" o:hralign="center" o:hrstd="t" o:hr="t" fillcolor="#a0a0a0" stroked="f"/>
         </w:pict>
       </w:r>
     </w:p>
@@ -4329,7 +4435,7 @@
           <w:lang w:val="en-IN"/>
         </w:rPr>
         <w:pict w14:anchorId="448CB4C9">
-          <v:rect id="_x0000_i1309" style="width:0;height:1.5pt" o:hralign="center" o:hrstd="t" o:hr="t" fillcolor="#a0a0a0" stroked="f"/>
+          <v:rect id="_x0000_i1057" style="width:0;height:1.5pt" o:hralign="center" o:hrstd="t" o:hr="t" fillcolor="#a0a0a0" stroked="f"/>
         </w:pict>
       </w:r>
     </w:p>
@@ -4399,8 +4505,16 @@
         <w:rPr>
           <w:lang w:val="en-IN"/>
         </w:rPr>
-        <w:t>git add .</w:t>
-      </w:r>
+        <w:t xml:space="preserve">git </w:t>
+      </w:r>
+      <w:proofErr w:type="gramStart"/>
+      <w:r>
+        <w:rPr>
+          <w:lang w:val="en-IN"/>
+        </w:rPr>
+        <w:t>add .</w:t>
+      </w:r>
+      <w:proofErr w:type="gramEnd"/>
     </w:p>
     <w:p>
       <w:pPr>
@@ -4478,7 +4592,7 @@
           <w:lang w:val="en-IN"/>
         </w:rPr>
         <w:pict w14:anchorId="65006D0B">
-          <v:rect id="_x0000_i1310" style="width:0;height:1.5pt" o:hralign="center" o:hrstd="t" o:hr="t" fillcolor="#a0a0a0" stroked="f"/>
+          <v:rect id="_x0000_i1058" style="width:0;height:1.5pt" o:hralign="center" o:hrstd="t" o:hr="t" fillcolor="#a0a0a0" stroked="f"/>
         </w:pict>
       </w:r>
     </w:p>
@@ -4553,7 +4667,7 @@
           <w:lang w:val="en-IN"/>
         </w:rPr>
         <w:pict w14:anchorId="5C6419A8">
-          <v:rect id="_x0000_i1311" style="width:0;height:1.5pt" o:hralign="center" o:hrstd="t" o:hr="t" fillcolor="#a0a0a0" stroked="f"/>
+          <v:rect id="_x0000_i1059" style="width:0;height:1.5pt" o:hralign="center" o:hrstd="t" o:hr="t" fillcolor="#a0a0a0" stroked="f"/>
         </w:pict>
       </w:r>
     </w:p>
@@ -4611,7 +4725,7 @@
           <w:lang w:val="en-IN"/>
         </w:rPr>
         <w:pict w14:anchorId="073939FF">
-          <v:rect id="_x0000_i1312" style="width:0;height:1.5pt" o:hralign="center" o:hrstd="t" o:hr="t" fillcolor="#a0a0a0" stroked="f"/>
+          <v:rect id="_x0000_i1060" style="width:0;height:1.5pt" o:hralign="center" o:hrstd="t" o:hr="t" fillcolor="#a0a0a0" stroked="f"/>
         </w:pict>
       </w:r>
     </w:p>
@@ -4682,7 +4796,7 @@
           <w:lang w:val="en-IN"/>
         </w:rPr>
         <w:pict w14:anchorId="397297B2">
-          <v:rect id="_x0000_i1313" style="width:0;height:1.5pt" o:hralign="center" o:hrstd="t" o:hr="t" fillcolor="#a0a0a0" stroked="f"/>
+          <v:rect id="_x0000_i1061" style="width:0;height:1.5pt" o:hralign="center" o:hrstd="t" o:hr="t" fillcolor="#a0a0a0" stroked="f"/>
         </w:pict>
       </w:r>
     </w:p>
@@ -4713,8 +4827,16 @@
         <w:rPr>
           <w:lang w:val="en-IN"/>
         </w:rPr>
-        <w:t>pip install mcp</w:t>
-      </w:r>
+        <w:t xml:space="preserve">pip install </w:t>
+      </w:r>
+      <w:proofErr w:type="spellStart"/>
+      <w:r>
+        <w:rPr>
+          <w:lang w:val="en-IN"/>
+        </w:rPr>
+        <w:t>mcp</w:t>
+      </w:r>
+      <w:proofErr w:type="spellEnd"/>
     </w:p>
     <w:p>
       <w:pPr>
@@ -4727,7 +4849,7 @@
           <w:lang w:val="en-IN"/>
         </w:rPr>
         <w:pict w14:anchorId="7C325A02">
-          <v:rect id="_x0000_i1314" style="width:0;height:1.5pt" o:hralign="center" o:hrstd="t" o:hr="t" fillcolor="#a0a0a0" stroked="f"/>
+          <v:rect id="_x0000_i1062" style="width:0;height:1.5pt" o:hralign="center" o:hrstd="t" o:hr="t" fillcolor="#a0a0a0" stroked="f"/>
         </w:pict>
       </w:r>
     </w:p>
@@ -4739,13 +4861,23 @@
           <w:lang w:val="en-IN"/>
         </w:rPr>
       </w:pPr>
-      <w:r>
-        <w:rPr>
-          <w:b/>
-          <w:bCs/>
-          <w:lang w:val="en-IN"/>
-        </w:rPr>
-        <w:t>PythonNET Missing</w:t>
+      <w:proofErr w:type="spellStart"/>
+      <w:r>
+        <w:rPr>
+          <w:b/>
+          <w:bCs/>
+          <w:lang w:val="en-IN"/>
+        </w:rPr>
+        <w:t>PythonNET</w:t>
+      </w:r>
+      <w:proofErr w:type="spellEnd"/>
+      <w:r>
+        <w:rPr>
+          <w:b/>
+          <w:bCs/>
+          <w:lang w:val="en-IN"/>
+        </w:rPr>
+        <w:t xml:space="preserve"> Missing</w:t>
       </w:r>
     </w:p>
     <w:p>
@@ -4759,8 +4891,16 @@
           <w:lang w:val="en-IN"/>
         </w:rPr>
         <w:lastRenderedPageBreak/>
-        <w:t>pip install pythonnet</w:t>
-      </w:r>
+        <w:t xml:space="preserve">pip install </w:t>
+      </w:r>
+      <w:proofErr w:type="spellStart"/>
+      <w:r>
+        <w:rPr>
+          <w:lang w:val="en-IN"/>
+        </w:rPr>
+        <w:t>pythonnet</w:t>
+      </w:r>
+      <w:proofErr w:type="spellEnd"/>
     </w:p>
     <w:p>
       <w:pPr>
@@ -4773,7 +4913,7 @@
           <w:lang w:val="en-IN"/>
         </w:rPr>
         <w:pict w14:anchorId="32B3F078">
-          <v:rect id="_x0000_i1315" style="width:0;height:1.5pt" o:hralign="center" o:hrstd="t" o:hr="t" fillcolor="#a0a0a0" stroked="f"/>
+          <v:rect id="_x0000_i1063" style="width:0;height:1.5pt" o:hralign="center" o:hrstd="t" o:hr="t" fillcolor="#a0a0a0" stroked="f"/>
         </w:pict>
       </w:r>
     </w:p>
@@ -4800,11 +4940,19 @@
           <w:lang w:val="en-IN"/>
         </w:rPr>
       </w:pPr>
-      <w:r>
-        <w:rPr>
-          <w:lang w:val="en-IN"/>
-        </w:rPr>
-        <w:t>npm install -g @modelcontextprotocol/inspector</w:t>
+      <w:proofErr w:type="spellStart"/>
+      <w:r>
+        <w:rPr>
+          <w:lang w:val="en-IN"/>
+        </w:rPr>
+        <w:t>npm</w:t>
+      </w:r>
+      <w:proofErr w:type="spellEnd"/>
+      <w:r>
+        <w:rPr>
+          <w:lang w:val="en-IN"/>
+        </w:rPr>
+        <w:t xml:space="preserve"> install -g @modelcontextprotocol/inspector</w:t>
       </w:r>
     </w:p>
     <w:p>
@@ -4818,7 +4966,7 @@
           <w:lang w:val="en-IN"/>
         </w:rPr>
         <w:pict w14:anchorId="3C1CFB3E">
-          <v:rect id="_x0000_i1316" style="width:0;height:1.5pt" o:hralign="center" o:hrstd="t" o:hr="t" fillcolor="#a0a0a0" stroked="f"/>
+          <v:rect id="_x0000_i1064" style="width:0;height:1.5pt" o:hralign="center" o:hrstd="t" o:hr="t" fillcolor="#a0a0a0" stroked="f"/>
         </w:pict>
       </w:r>
     </w:p>
@@ -5145,7 +5293,7 @@
           <w:lang w:val="en-IN"/>
         </w:rPr>
         <w:pict w14:anchorId="3EDF5696">
-          <v:rect id="_x0000_i1317" style="width:0;height:1.5pt" o:hralign="center" o:hrstd="t" o:hr="t" fillcolor="#a0a0a0" stroked="f"/>
+          <v:rect id="_x0000_i1065" style="width:0;height:1.5pt" o:hralign="center" o:hrstd="t" o:hr="t" fillcolor="#a0a0a0" stroked="f"/>
         </w:pict>
       </w:r>
     </w:p>
@@ -5474,7 +5622,7 @@
           <w:lang w:val="en-IN"/>
         </w:rPr>
         <w:pict w14:anchorId="190982E6">
-          <v:rect id="_x0000_i1318" style="width:0;height:1.5pt" o:hralign="center" o:hrstd="t" o:hr="t" fillcolor="#a0a0a0" stroked="f"/>
+          <v:rect id="_x0000_i1066" style="width:0;height:1.5pt" o:hralign="center" o:hrstd="t" o:hr="t" fillcolor="#a0a0a0" stroked="f"/>
         </w:pict>
       </w:r>
     </w:p>
@@ -5752,7 +5900,6 @@
               <v:path gradientshapeok="t" o:connecttype="rect"/>
             </v:shapetype>
             <v:shape id="Text Box 2" o:spid="_x0000_s1026" type="#_x0000_t202" alt="SLB-Private" style="position:absolute;margin-left:0;margin-top:0;width:49.95pt;height:29pt;z-index:251659264;visibility:visible;mso-wrap-style:none;mso-wrap-distance-left:0;mso-wrap-distance-top:0;mso-wrap-distance-right:0;mso-wrap-distance-bottom:0;mso-position-horizontal:center;mso-position-horizontal-relative:page;mso-position-vertical:bottom;mso-position-vertical-relative:page;v-text-anchor:bottom" o:gfxdata="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" filled="f" stroked="f">
-              <v:fill o:detectmouseclick="t"/>
               <v:textbox style="mso-fit-shape-to-text:t" inset="0,0,0,15pt">
                 <w:txbxContent>
                   <w:p>
@@ -5794,125 +5941,6 @@
     <w:pPr>
       <w:pStyle w:val="Footer"/>
     </w:pPr>
-    <w:r>
-      <w:rPr>
-        <w:noProof/>
-      </w:rPr>
-      <mc:AlternateContent>
-        <mc:Choice Requires="wps">
-          <w:drawing>
-            <wp:anchor distT="0" distB="0" distL="0" distR="0" simplePos="0" relativeHeight="251660288" behindDoc="0" locked="0" layoutInCell="1" allowOverlap="1" wp14:anchorId="52B3A6E5" wp14:editId="3B78D453">
-              <wp:simplePos x="776377" y="9575321"/>
-              <wp:positionH relativeFrom="page">
-                <wp:align>center</wp:align>
-              </wp:positionH>
-              <wp:positionV relativeFrom="page">
-                <wp:align>bottom</wp:align>
-              </wp:positionV>
-              <wp:extent cx="634365" cy="368300"/>
-              <wp:effectExtent l="0" t="0" r="13335" b="0"/>
-              <wp:wrapNone/>
-              <wp:docPr id="1937587570" name="Text Box 3" descr="SLB-Private">
-                <a:extLst xmlns:a="http://schemas.openxmlformats.org/drawingml/2006/main">
-                  <a:ext uri="{5AE41FA2-C0FF-4470-9BD4-5FADCA87CBE2}">
-                    <aclsh:classification xmlns:aclsh="http://schemas.microsoft.com/office/drawing/2020/classificationShape" classificationOutcomeType="ftr"/>
-                  </a:ext>
-                </a:extLst>
-              </wp:docPr>
-              <wp:cNvGraphicFramePr/>
-              <a:graphic xmlns:a="http://schemas.openxmlformats.org/drawingml/2006/main">
-                <a:graphicData uri="http://schemas.microsoft.com/office/word/2010/wordprocessingShape">
-                  <wps:wsp>
-                    <wps:cNvSpPr txBox="1"/>
-                    <wps:spPr>
-                      <a:xfrm>
-                        <a:off x="0" y="0"/>
-                        <a:ext cx="634365" cy="368300"/>
-                      </a:xfrm>
-                      <a:prstGeom prst="rect">
-                        <a:avLst/>
-                      </a:prstGeom>
-                      <a:noFill/>
-                      <a:ln>
-                        <a:noFill/>
-                      </a:ln>
-                    </wps:spPr>
-                    <wps:txbx>
-                      <w:txbxContent>
-                        <w:p>
-                          <w:pPr>
-                            <w:rPr>
-                              <w:rFonts w:ascii="Aptos" w:eastAsia="Aptos" w:hAnsi="Aptos" w:cs="Aptos"/>
-                              <w:noProof/>
-                              <w:color w:val="000000"/>
-                              <w:sz w:val="20"/>
-                              <w:szCs w:val="20"/>
-                            </w:rPr>
-                          </w:pPr>
-                          <w:r>
-                            <w:rPr>
-                              <w:rFonts w:ascii="Aptos" w:eastAsia="Aptos" w:hAnsi="Aptos" w:cs="Aptos"/>
-                              <w:noProof/>
-                              <w:color w:val="000000"/>
-                              <w:sz w:val="20"/>
-                              <w:szCs w:val="20"/>
-                            </w:rPr>
-                            <w:t>SLB-Private</w:t>
-                          </w:r>
-                        </w:p>
-                      </w:txbxContent>
-                    </wps:txbx>
-                    <wps:bodyPr rot="0" spcFirstLastPara="0" vertOverflow="overflow" horzOverflow="overflow" vert="horz" wrap="none" lIns="0" tIns="0" rIns="0" bIns="190500" numCol="1" spcCol="0" rtlCol="0" fromWordArt="0" anchor="b" anchorCtr="0" forceAA="0" compatLnSpc="1">
-                      <a:prstTxWarp prst="textNoShape">
-                        <a:avLst/>
-                      </a:prstTxWarp>
-                      <a:spAutoFit/>
-                    </wps:bodyPr>
-                  </wps:wsp>
-                </a:graphicData>
-              </a:graphic>
-            </wp:anchor>
-          </w:drawing>
-        </mc:Choice>
-        <mc:Fallback>
-          <w:pict>
-            <v:shapetype w14:anchorId="52B3A6E5" id="_x0000_t202" coordsize="21600,21600" o:spt="202" path="m,l,21600r21600,l21600,xe">
-              <v:stroke joinstyle="miter"/>
-              <v:path gradientshapeok="t" o:connecttype="rect"/>
-            </v:shapetype>
-            <v:shape id="Text Box 3" o:spid="_x0000_s1027" type="#_x0000_t202" alt="SLB-Private" style="position:absolute;margin-left:0;margin-top:0;width:49.95pt;height:29pt;z-index:251660288;visibility:visible;mso-wrap-style:none;mso-wrap-distance-left:0;mso-wrap-distance-top:0;mso-wrap-distance-right:0;mso-wrap-distance-bottom:0;mso-position-horizontal:center;mso-position-horizontal-relative:page;mso-position-vertical:bottom;mso-position-vertical-relative:page;v-text-anchor:bottom" o:gfxdata="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" filled="f" stroked="f">
-              <v:fill o:detectmouseclick="t"/>
-              <v:textbox style="mso-fit-shape-to-text:t" inset="0,0,0,15pt">
-                <w:txbxContent>
-                  <w:p>
-                    <w:pPr>
-                      <w:rPr>
-                        <w:rFonts w:ascii="Aptos" w:eastAsia="Aptos" w:hAnsi="Aptos" w:cs="Aptos"/>
-                        <w:noProof/>
-                        <w:color w:val="000000"/>
-                        <w:sz w:val="20"/>
-                        <w:szCs w:val="20"/>
-                      </w:rPr>
-                    </w:pPr>
-                    <w:r>
-                      <w:rPr>
-                        <w:rFonts w:ascii="Aptos" w:eastAsia="Aptos" w:hAnsi="Aptos" w:cs="Aptos"/>
-                        <w:noProof/>
-                        <w:color w:val="000000"/>
-                        <w:sz w:val="20"/>
-                        <w:szCs w:val="20"/>
-                      </w:rPr>
-                      <w:t>SLB-Private</w:t>
-                    </w:r>
-                  </w:p>
-                </w:txbxContent>
-              </v:textbox>
-              <w10:wrap anchorx="page" anchory="page"/>
-            </v:shape>
-          </w:pict>
-        </mc:Fallback>
-      </mc:AlternateContent>
-    </w:r>
   </w:p>
 </w:ftr>
 </file>
@@ -6009,8 +6037,7 @@
               <v:stroke joinstyle="miter"/>
               <v:path gradientshapeok="t" o:connecttype="rect"/>
             </v:shapetype>
-            <v:shape id="Text Box 1" o:spid="_x0000_s1028" type="#_x0000_t202" alt="SLB-Private" style="position:absolute;margin-left:0;margin-top:0;width:49.95pt;height:29pt;z-index:251658240;visibility:visible;mso-wrap-style:none;mso-wrap-distance-left:0;mso-wrap-distance-top:0;mso-wrap-distance-right:0;mso-wrap-distance-bottom:0;mso-position-horizontal:center;mso-position-horizontal-relative:page;mso-position-vertical:bottom;mso-position-vertical-relative:page;v-text-anchor:bottom" o:gfxdata="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" filled="f" stroked="f">
-              <v:fill o:detectmouseclick="t"/>
+            <v:shape id="Text Box 1" o:spid="_x0000_s1027" type="#_x0000_t202" alt="SLB-Private" style="position:absolute;margin-left:0;margin-top:0;width:49.95pt;height:29pt;z-index:251658240;visibility:visible;mso-wrap-style:none;mso-wrap-distance-left:0;mso-wrap-distance-top:0;mso-wrap-distance-right:0;mso-wrap-distance-bottom:0;mso-position-horizontal:center;mso-position-horizontal-relative:page;mso-position-vertical:bottom;mso-position-vertical-relative:page;v-text-anchor:bottom" o:gfxdata="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" filled="f" stroked="f">
               <v:textbox style="mso-fit-shape-to-text:t" inset="0,0,0,15pt">
                 <w:txbxContent>
                   <w:p>
@@ -7663,6 +7690,7 @@
   <w:style w:type="character" w:default="1" w:styleId="DefaultParagraphFont">
     <w:name w:val="Default Paragraph Font"/>
     <w:uiPriority w:val="1"/>
+    <w:semiHidden/>
     <w:unhideWhenUsed/>
   </w:style>
   <w:style w:type="table" w:default="1" w:styleId="TableNormal">
@@ -8622,13 +8650,12 @@
 </file>
 
 <file path=customXml/item1.xml><?xml version="1.0" encoding="utf-8"?>
-<p:properties xmlns:p="http://schemas.microsoft.com/office/2006/metadata/properties" xmlns:xsi="http://www.w3.org/2001/XMLSchema-instance" xmlns:pc="http://schemas.microsoft.com/office/infopath/2007/PartnerControls">
-  <documentManagement>
-    <lcf76f155ced4ddcb4097134ff3c332f xmlns="f8393d0d-bc01-41cc-80e2-d7458440135e">
-      <Terms xmlns="http://schemas.microsoft.com/office/infopath/2007/PartnerControls"/>
-    </lcf76f155ced4ddcb4097134ff3c332f>
-  </documentManagement>
-</p:properties>
+<?mso-contentType ?>
+<FormTemplates xmlns="http://schemas.microsoft.com/sharepoint/v3/contenttype/forms">
+  <Display>DocumentLibraryForm</Display>
+  <Edit>DocumentLibraryForm</Edit>
+  <New>DocumentLibraryForm</New>
+</FormTemplates>
 </file>
 
 <file path=customXml/item2.xml><?xml version="1.0" encoding="utf-8"?>
@@ -8798,20 +8825,19 @@
 </file>
 
 <file path=customXml/item3.xml><?xml version="1.0" encoding="utf-8"?>
-<?mso-contentType ?>
-<FormTemplates xmlns="http://schemas.microsoft.com/sharepoint/v3/contenttype/forms">
-  <Display>DocumentLibraryForm</Display>
-  <Edit>DocumentLibraryForm</Edit>
-  <New>DocumentLibraryForm</New>
-</FormTemplates>
+<p:properties xmlns:p="http://schemas.microsoft.com/office/2006/metadata/properties" xmlns:xsi="http://www.w3.org/2001/XMLSchema-instance" xmlns:pc="http://schemas.microsoft.com/office/infopath/2007/PartnerControls">
+  <documentManagement>
+    <lcf76f155ced4ddcb4097134ff3c332f xmlns="f8393d0d-bc01-41cc-80e2-d7458440135e">
+      <Terms xmlns="http://schemas.microsoft.com/office/infopath/2007/PartnerControls"/>
+    </lcf76f155ced4ddcb4097134ff3c332f>
+  </documentManagement>
+</p:properties>
 </file>
 
 <file path=customXml/itemProps1.xml><?xml version="1.0" encoding="utf-8"?>
-<ds:datastoreItem xmlns:ds="http://schemas.openxmlformats.org/officeDocument/2006/customXml" ds:itemID="{305CD977-AB85-4DFE-8BD6-46D1BFD0F0ED}">
+<ds:datastoreItem xmlns:ds="http://schemas.openxmlformats.org/officeDocument/2006/customXml" ds:itemID="{6BD10697-D754-4B0F-9ACE-82CAE11369FB}">
   <ds:schemaRefs>
-    <ds:schemaRef ds:uri="http://schemas.microsoft.com/office/2006/metadata/properties"/>
-    <ds:schemaRef ds:uri="http://schemas.microsoft.com/office/infopath/2007/PartnerControls"/>
-    <ds:schemaRef ds:uri="f8393d0d-bc01-41cc-80e2-d7458440135e"/>
+    <ds:schemaRef ds:uri="http://schemas.microsoft.com/sharepoint/v3/contenttype/forms"/>
   </ds:schemaRefs>
 </ds:datastoreItem>
 </file>
@@ -8835,9 +8861,11 @@
 </file>
 
 <file path=customXml/itemProps3.xml><?xml version="1.0" encoding="utf-8"?>
-<ds:datastoreItem xmlns:ds="http://schemas.openxmlformats.org/officeDocument/2006/customXml" ds:itemID="{6BD10697-D754-4B0F-9ACE-82CAE11369FB}">
+<ds:datastoreItem xmlns:ds="http://schemas.openxmlformats.org/officeDocument/2006/customXml" ds:itemID="{305CD977-AB85-4DFE-8BD6-46D1BFD0F0ED}">
   <ds:schemaRefs>
-    <ds:schemaRef ds:uri="http://schemas.microsoft.com/sharepoint/v3/contenttype/forms"/>
+    <ds:schemaRef ds:uri="http://schemas.microsoft.com/office/2006/metadata/properties"/>
+    <ds:schemaRef ds:uri="http://schemas.microsoft.com/office/infopath/2007/PartnerControls"/>
+    <ds:schemaRef ds:uri="f8393d0d-bc01-41cc-80e2-d7458440135e"/>
   </ds:schemaRefs>
 </ds:datastoreItem>
 </file>

</xml_diff>